<commit_message>
S10: informe completo con figuras, capturas demo y docs FastAPI/React.
Regenera el PDF/DOCX embebiendo evidencias y paneles del prototipo para la entrega Moodle, y alinea README/bitácora con la rama de integración.
</commit_message>
<xml_diff>
--- a/s10/docs/S10_Avance_Consolidado.docx
+++ b/s10/docs/S10_Avance_Consolidado.docx
@@ -21,14 +21,14 @@
         </w:rPr>
         <w:t>Patricio Bayas Meza · José Puebla Paladines · Marco Zurita Rojas</w:t>
         <w:br/>
-        <w:t>2026-08-17</w:t>
+        <w:t>2026-08-23</w:t>
         <w:br/>
         <w:t>https://github.com/marcoz1691/MIA_Deteccion_HC</w:t>
       </w:r>
     </w:p>
     <w:p>
       <w:r>
-        <w:t>Detección de inconsistencias en historias clínicas (CITIMED / MEDEC). Documento generado desde métricas del repositorio.</w:t>
+        <w:t>Detección de inconsistencias en historias clínicas (CITIMED / MEDEC). Documento generado desde métricas del repositorio, con figuras y capturas del prototipo.</w:t>
       </w:r>
     </w:p>
     <w:p>
@@ -56,7 +56,7 @@
     </w:p>
     <w:p>
       <w:r>
-        <w:t>Se implementaron tres brazos (TF-IDF, LLM zero-shot, LLM+RAG), demo Streamlit, fallback explícito a TF-IDF, soporte Ollama on-premise para PHI y evaluaciones por tipo de error y sesgo EN-ES.</w:t>
+        <w:t>Se implementaron tres brazos (TF-IDF, LLM zero-shot, LLM+RAG), demo Streamlit, API REST FastAPI (POST /generar), frontend React, fallback explícito a TF-IDF, soporte Ollama on-premise para PHI y evaluaciones por tipo de error y sesgo EN-ES.</w:t>
       </w:r>
     </w:p>
     <w:p>
@@ -116,7 +116,23 @@
         <w:pStyle w:val="ListBullet"/>
       </w:pPr>
       <w:r>
-        <w:t>• Inferencia unificada: s7/inferencia.py (demo + scripts de evaluación)</w:t>
+        <w:t>• Inferencia unificada: s7/inferencia.py (demo, API y scripts de evaluación)</w:t>
+      </w:r>
+    </w:p>
+    <w:p>
+      <w:pPr>
+        <w:pStyle w:val="ListBullet"/>
+      </w:pPr>
+      <w:r>
+        <w:t>• API REST: FastAPI en api/ — GET /health, POST /generar (InferenceService)</w:t>
+      </w:r>
+    </w:p>
+    <w:p>
+      <w:pPr>
+        <w:pStyle w:val="ListBullet"/>
+      </w:pPr>
+      <w:r>
+        <w:t>• Frontend React + Vite en frontend/ — proxy a la API en puerto 8000</w:t>
       </w:r>
     </w:p>
     <w:p>
@@ -129,7 +145,7 @@
     </w:p>
     <w:p>
       <w:r>
-        <w:t>2.3 Trabajo futuro (NO implementado en S10): LangChain/LlamaIndex, Docker/microservicios, DVC, MLflow operativo (requirements-optional.txt), cascada TF-IDF→LLM en inferencia, corrección sugerida/faithfulness RAG, índice CIE-10 formal, corpus CITIMED anonimizado.</w:t>
+        <w:t>2.3 Trabajo futuro (NO implementado en S10): LangChain/LlamaIndex, Docker Compose, DVC, MLflow operativo (requirements-optional.txt), cascada TF-IDF→LLM en inferencia, corrección sugerida/faithfulness RAG, índice CIE-10 formal, corpus CITIMED anonimizado.</w:t>
       </w:r>
     </w:p>
     <w:p>
@@ -206,7 +222,7 @@
         <w:pStyle w:val="NoSpacing"/>
       </w:pPr>
       <w:r>
-        <w:t>| Demo Streamlit | demo/ | demo/README.md, s10/evidencias/capturas/ |</w:t>
+        <w:t>| Demo Streamlit | demo/ | demo/README.md + capturas s10/evidencias/capturas/ |</w:t>
       </w:r>
     </w:p>
     <w:p>
@@ -214,7 +230,23 @@
         <w:pStyle w:val="NoSpacing"/>
       </w:pPr>
       <w:r>
-        <w:t>| Fallback API → TF-IDF | s7/inferencia.py | modo_degradado=True, test_fallback |</w:t>
+        <w:t>| API REST FastAPI | api/main.py, api/service.py | GET /health, POST /generar, OpenAPI /docs |</w:t>
+      </w:r>
+    </w:p>
+    <w:p>
+      <w:pPr>
+        <w:pStyle w:val="NoSpacing"/>
+      </w:pPr>
+      <w:r>
+        <w:t>| Frontend React | frontend/ | NotaInput + ResultadosPanel, proxy Vite → :8000 |</w:t>
+      </w:r>
+    </w:p>
+    <w:p>
+      <w:pPr>
+        <w:pStyle w:val="NoSpacing"/>
+      </w:pPr>
+      <w:r>
+        <w:t>| Fallback API → TF-IDF | s7/inferencia.py, api/service.py | modo_degradado=True, test_fallback |</w:t>
       </w:r>
     </w:p>
     <w:p>
@@ -281,7 +313,101 @@
     </w:p>
     <w:p>
       <w:r>
-        <w:t>Figura: s6/figura_ajuste.png (curvas ROC/PR y lift).</w:t>
+        <w:t>Figuras embebidas a continuación (origen: s6/figura_ajuste.png y s10/evidencias/).</w:t>
+      </w:r>
+    </w:p>
+    <w:p>
+      <w:r>
+        <w:drawing>
+          <wp:inline xmlns:a="http://schemas.openxmlformats.org/drawingml/2006/main" xmlns:pic="http://schemas.openxmlformats.org/drawingml/2006/picture">
+            <wp:extent cx="5669280" cy="1700784"/>
+            <wp:docPr id="1" name="Picture 1"/>
+            <wp:cNvGraphicFramePr>
+              <a:graphicFrameLocks noChangeAspect="1"/>
+            </wp:cNvGraphicFramePr>
+            <a:graphic>
+              <a:graphicData uri="http://schemas.openxmlformats.org/drawingml/2006/picture">
+                <pic:pic>
+                  <pic:nvPicPr>
+                    <pic:cNvPr id="0" name="figura_ajuste.png"/>
+                    <pic:cNvPicPr/>
+                  </pic:nvPicPr>
+                  <pic:blipFill>
+                    <a:blip r:embed="rId9"/>
+                    <a:stretch>
+                      <a:fillRect/>
+                    </a:stretch>
+                  </pic:blipFill>
+                  <pic:spPr>
+                    <a:xfrm>
+                      <a:off x="0" y="0"/>
+                      <a:ext cx="5669280" cy="1700784"/>
+                    </a:xfrm>
+                    <a:prstGeom prst="rect"/>
+                  </pic:spPr>
+                </pic:pic>
+              </a:graphicData>
+            </a:graphic>
+          </wp:inline>
+        </w:drawing>
+      </w:r>
+    </w:p>
+    <w:p>
+      <w:pPr>
+        <w:jc w:val="center"/>
+      </w:pPr>
+      <w:r>
+        <w:rPr>
+          <w:i/>
+        </w:rPr>
+        <w:t>Figura 1. Curvas ROC/PR y lift — TF-IDF ajustado (MEDEC).</w:t>
+      </w:r>
+    </w:p>
+    <w:p>
+      <w:r>
+        <w:drawing>
+          <wp:inline xmlns:a="http://schemas.openxmlformats.org/drawingml/2006/main" xmlns:pic="http://schemas.openxmlformats.org/drawingml/2006/picture">
+            <wp:extent cx="5029200" cy="1508760"/>
+            <wp:docPr id="2" name="Picture 2"/>
+            <wp:cNvGraphicFramePr>
+              <a:graphicFrameLocks noChangeAspect="1"/>
+            </wp:cNvGraphicFramePr>
+            <a:graphic>
+              <a:graphicData uri="http://schemas.openxmlformats.org/drawingml/2006/picture">
+                <pic:pic>
+                  <pic:nvPicPr>
+                    <pic:cNvPr id="0" name="figura_ajuste.png"/>
+                    <pic:cNvPicPr/>
+                  </pic:nvPicPr>
+                  <pic:blipFill>
+                    <a:blip r:embed="rId9"/>
+                    <a:stretch>
+                      <a:fillRect/>
+                    </a:stretch>
+                  </pic:blipFill>
+                  <pic:spPr>
+                    <a:xfrm>
+                      <a:off x="0" y="0"/>
+                      <a:ext cx="5029200" cy="1508760"/>
+                    </a:xfrm>
+                    <a:prstGeom prst="rect"/>
+                  </pic:spPr>
+                </pic:pic>
+              </a:graphicData>
+            </a:graphic>
+          </wp:inline>
+        </w:drawing>
+      </w:r>
+    </w:p>
+    <w:p>
+      <w:pPr>
+        <w:jc w:val="center"/>
+      </w:pPr>
+      <w:r>
+        <w:rPr>
+          <w:i/>
+        </w:rPr>
+        <w:t>Figura 1b. Curvas TF-IDF (evidencia S6).</w:t>
       </w:r>
     </w:p>
     <w:p>
@@ -396,26 +522,238 @@
       </w:r>
     </w:p>
     <w:p>
+      <w:r>
+        <w:drawing>
+          <wp:inline xmlns:a="http://schemas.openxmlformats.org/drawingml/2006/main" xmlns:pic="http://schemas.openxmlformats.org/drawingml/2006/picture">
+            <wp:extent cx="5303520" cy="1515291"/>
+            <wp:docPr id="3" name="Picture 3"/>
+            <wp:cNvGraphicFramePr>
+              <a:graphicFrameLocks noChangeAspect="1"/>
+            </wp:cNvGraphicFramePr>
+            <a:graphic>
+              <a:graphicData uri="http://schemas.openxmlformats.org/drawingml/2006/picture">
+                <pic:pic>
+                  <pic:nvPicPr>
+                    <pic:cNvPr id="0" name="figura_comparacion_tripartita.png"/>
+                    <pic:cNvPicPr/>
+                  </pic:nvPicPr>
+                  <pic:blipFill>
+                    <a:blip r:embed="rId10"/>
+                    <a:stretch>
+                      <a:fillRect/>
+                    </a:stretch>
+                  </pic:blipFill>
+                  <pic:spPr>
+                    <a:xfrm>
+                      <a:off x="0" y="0"/>
+                      <a:ext cx="5303520" cy="1515291"/>
+                    </a:xfrm>
+                    <a:prstGeom prst="rect"/>
+                  </pic:spPr>
+                </pic:pic>
+              </a:graphicData>
+            </a:graphic>
+          </wp:inline>
+        </w:drawing>
+      </w:r>
+    </w:p>
+    <w:p>
+      <w:pPr>
+        <w:jc w:val="center"/>
+      </w:pPr>
+      <w:r>
+        <w:rPr>
+          <w:i/>
+        </w:rPr>
+        <w:t>Figura 2. Comparacion tripartita TF-IDF / LLM / LLM+RAG.</w:t>
+      </w:r>
+    </w:p>
+    <w:p>
+      <w:r>
+        <w:drawing>
+          <wp:inline xmlns:a="http://schemas.openxmlformats.org/drawingml/2006/main" xmlns:pic="http://schemas.openxmlformats.org/drawingml/2006/picture">
+            <wp:extent cx="5303520" cy="2651760"/>
+            <wp:docPr id="4" name="Picture 4"/>
+            <wp:cNvGraphicFramePr>
+              <a:graphicFrameLocks noChangeAspect="1"/>
+            </wp:cNvGraphicFramePr>
+            <a:graphic>
+              <a:graphicData uri="http://schemas.openxmlformats.org/drawingml/2006/picture">
+                <pic:pic>
+                  <pic:nvPicPr>
+                    <pic:cNvPr id="0" name="heatmap_recall_por_tipo.png"/>
+                    <pic:cNvPicPr/>
+                  </pic:nvPicPr>
+                  <pic:blipFill>
+                    <a:blip r:embed="rId11"/>
+                    <a:stretch>
+                      <a:fillRect/>
+                    </a:stretch>
+                  </pic:blipFill>
+                  <pic:spPr>
+                    <a:xfrm>
+                      <a:off x="0" y="0"/>
+                      <a:ext cx="5303520" cy="2651760"/>
+                    </a:xfrm>
+                    <a:prstGeom prst="rect"/>
+                  </pic:spPr>
+                </pic:pic>
+              </a:graphicData>
+            </a:graphic>
+          </wp:inline>
+        </w:drawing>
+      </w:r>
+    </w:p>
+    <w:p>
+      <w:pPr>
+        <w:jc w:val="center"/>
+      </w:pPr>
+      <w:r>
+        <w:rPr>
+          <w:i/>
+        </w:rPr>
+        <w:t>Figura 3. Recall por ErrorType (TF-IDF).</w:t>
+      </w:r>
+    </w:p>
+    <w:p>
+      <w:r>
+        <w:drawing>
+          <wp:inline xmlns:a="http://schemas.openxmlformats.org/drawingml/2006/main" xmlns:pic="http://schemas.openxmlformats.org/drawingml/2006/picture">
+            <wp:extent cx="5029200" cy="3771900"/>
+            <wp:docPr id="5" name="Picture 5"/>
+            <wp:cNvGraphicFramePr>
+              <a:graphicFrameLocks noChangeAspect="1"/>
+            </wp:cNvGraphicFramePr>
+            <a:graphic>
+              <a:graphicData uri="http://schemas.openxmlformats.org/drawingml/2006/picture">
+                <pic:pic>
+                  <pic:nvPicPr>
+                    <pic:cNvPr id="0" name="shap_summary_bar.png"/>
+                    <pic:cNvPicPr/>
+                  </pic:nvPicPr>
+                  <pic:blipFill>
+                    <a:blip r:embed="rId12"/>
+                    <a:stretch>
+                      <a:fillRect/>
+                    </a:stretch>
+                  </pic:blipFill>
+                  <pic:spPr>
+                    <a:xfrm>
+                      <a:off x="0" y="0"/>
+                      <a:ext cx="5029200" cy="3771900"/>
+                    </a:xfrm>
+                    <a:prstGeom prst="rect"/>
+                  </pic:spPr>
+                </pic:pic>
+              </a:graphicData>
+            </a:graphic>
+          </wp:inline>
+        </w:drawing>
+      </w:r>
+    </w:p>
+    <w:p>
+      <w:pPr>
+        <w:jc w:val="center"/>
+      </w:pPr>
+      <w:r>
+        <w:rPr>
+          <w:i/>
+        </w:rPr>
+        <w:t>Figura 4. Interpretabilidad SHAP (TF-IDF).</w:t>
+      </w:r>
+    </w:p>
+    <w:p>
       <w:pPr>
         <w:pStyle w:val="Heading1"/>
       </w:pPr>
       <w:r>
-        <w:t>6. Demo y robustez operativa</w:t>
+        <w:t>6. Demo, API y robustez operativa</w:t>
       </w:r>
     </w:p>
     <w:p>
       <w:r>
-        <w:t>Demo Streamlit (demo/app.py): análisis tripartita, página Métricas, configuración de brazos.</w:t>
+        <w:t>6.1 Demo Streamlit (demo/app.py): análisis tripartita, página Métricas, configuración de brazos.</w:t>
       </w:r>
     </w:p>
     <w:p>
       <w:r>
-        <w:t>Mock LLM activo por defecto — ningún dato sale del equipo sin consentimiento explícito.</w:t>
+        <w:t>6.2 API FastAPI (api/): expone el mismo pipeline que la demo vía HTTP.</w:t>
+      </w:r>
+    </w:p>
+    <w:p>
+      <w:pPr>
+        <w:pStyle w:val="ListBullet"/>
+      </w:pPr>
+      <w:r>
+        <w:t>• GET /health — estado del servicio y disponibilidad del modelo TF-IDF</w:t>
+      </w:r>
+    </w:p>
+    <w:p>
+      <w:pPr>
+        <w:pStyle w:val="ListBullet"/>
+      </w:pPr>
+      <w:r>
+        <w:t>• POST /generar — payload JSON: nota_clinica, mock_llm (default true), idioma, brazos, umbral</w:t>
+      </w:r>
+    </w:p>
+    <w:p>
+      <w:pPr>
+        <w:pStyle w:val="ListBullet"/>
+      </w:pPr>
+      <w:r>
+        <w:t>• InferenceService carga TF-IDF, LLMClient y RAGIndex al arrancar (lifespan)</w:t>
+      </w:r>
+    </w:p>
+    <w:p>
+      <w:pPr>
+        <w:pStyle w:val="ListBullet"/>
+      </w:pPr>
+      <w:r>
+        <w:t>• CORS habilitado para el frontend React; documentación OpenAPI en /docs</w:t>
+      </w:r>
+    </w:p>
+    <w:p>
+      <w:pPr>
+        <w:pStyle w:val="ListBullet"/>
+      </w:pPr>
+      <w:r>
+        <w:t>• Arranque: uvicorn api.main:app --reload --port 8000</w:t>
       </w:r>
     </w:p>
     <w:p>
       <w:r>
-        <w:t>Fallback: si la API LLM falla (LLMUnavailableError), inferencia continúa con TF-IDF, modo_degradado=True y banner visible al usuario (verificado en s7/test_fallback.py).</w:t>
+        <w:t>6.3 Frontend React (frontend/): cliente mínimo con Vite.</w:t>
+      </w:r>
+    </w:p>
+    <w:p>
+      <w:pPr>
+        <w:pStyle w:val="ListBullet"/>
+      </w:pPr>
+      <w:r>
+        <w:t>• npm run dev → http://localhost:5173; proxy /generar y /health hacia :8000</w:t>
+      </w:r>
+    </w:p>
+    <w:p>
+      <w:pPr>
+        <w:pStyle w:val="ListBullet"/>
+      </w:pPr>
+      <w:r>
+        <w:t>• Muestra top1 (oración sospechosa) y tabla de scores por brazo</w:t>
+      </w:r>
+    </w:p>
+    <w:p>
+      <w:r>
+        <w:t>6.4 Seguridad y fallback:</w:t>
+      </w:r>
+    </w:p>
+    <w:p>
+      <w:r>
+        <w:t>Mock LLM activo por defecto — ningún dato sale del equipo sin consentimiento explícito (Streamlit).</w:t>
+      </w:r>
+    </w:p>
+    <w:p>
+      <w:r>
+        <w:t>Fallback: si la API LLM falla (LLMUnavailableError), inferencia continúa con TF-IDF, modo_degradado=True y mensaje en la respuesta JSON (verificado en s7/test_fallback.py).</w:t>
       </w:r>
     </w:p>
     <w:p>
@@ -425,7 +763,153 @@
     </w:p>
     <w:p>
       <w:r>
-        <w:t>Auditoría: salidas_s7/audit.log registra hash SHA-256 de la nota, n_oraciones y brazos — sin texto clínico en logs.</w:t>
+        <w:t>Auditoría Streamlit: salidas_s7/audit.log registra hash SHA-256 de la nota — sin texto clínico.</w:t>
+      </w:r>
+    </w:p>
+    <w:p>
+      <w:r>
+        <w:t>Capturas del prototipo embebidas a continuación (s10/evidencias/capturas/).</w:t>
+      </w:r>
+    </w:p>
+    <w:p>
+      <w:r>
+        <w:drawing>
+          <wp:inline xmlns:a="http://schemas.openxmlformats.org/drawingml/2006/main" xmlns:pic="http://schemas.openxmlformats.org/drawingml/2006/picture">
+            <wp:extent cx="5486400" cy="3591098"/>
+            <wp:docPr id="6" name="Picture 6"/>
+            <wp:cNvGraphicFramePr>
+              <a:graphicFrameLocks noChangeAspect="1"/>
+            </wp:cNvGraphicFramePr>
+            <a:graphic>
+              <a:graphicData uri="http://schemas.openxmlformats.org/drawingml/2006/picture">
+                <pic:pic>
+                  <pic:nvPicPr>
+                    <pic:cNvPr id="0" name="demo_analisis.png"/>
+                    <pic:cNvPicPr/>
+                  </pic:nvPicPr>
+                  <pic:blipFill>
+                    <a:blip r:embed="rId13"/>
+                    <a:stretch>
+                      <a:fillRect/>
+                    </a:stretch>
+                  </pic:blipFill>
+                  <pic:spPr>
+                    <a:xfrm>
+                      <a:off x="0" y="0"/>
+                      <a:ext cx="5486400" cy="3591098"/>
+                    </a:xfrm>
+                    <a:prstGeom prst="rect"/>
+                  </pic:spPr>
+                </pic:pic>
+              </a:graphicData>
+            </a:graphic>
+          </wp:inline>
+        </w:drawing>
+      </w:r>
+    </w:p>
+    <w:p>
+      <w:pPr>
+        <w:jc w:val="center"/>
+      </w:pPr>
+      <w:r>
+        <w:rPr>
+          <w:i/>
+        </w:rPr>
+        <w:t>Figura 5. Demo — analisis ejemplo medicacion (mock LLM).</w:t>
+      </w:r>
+    </w:p>
+    <w:p>
+      <w:r>
+        <w:drawing>
+          <wp:inline xmlns:a="http://schemas.openxmlformats.org/drawingml/2006/main" xmlns:pic="http://schemas.openxmlformats.org/drawingml/2006/picture">
+            <wp:extent cx="5303520" cy="2507119"/>
+            <wp:docPr id="7" name="Picture 7"/>
+            <wp:cNvGraphicFramePr>
+              <a:graphicFrameLocks noChangeAspect="1"/>
+            </wp:cNvGraphicFramePr>
+            <a:graphic>
+              <a:graphicData uri="http://schemas.openxmlformats.org/drawingml/2006/picture">
+                <pic:pic>
+                  <pic:nvPicPr>
+                    <pic:cNvPr id="0" name="demo_metricas.png"/>
+                    <pic:cNvPicPr/>
+                  </pic:nvPicPr>
+                  <pic:blipFill>
+                    <a:blip r:embed="rId14"/>
+                    <a:stretch>
+                      <a:fillRect/>
+                    </a:stretch>
+                  </pic:blipFill>
+                  <pic:spPr>
+                    <a:xfrm>
+                      <a:off x="0" y="0"/>
+                      <a:ext cx="5303520" cy="2507119"/>
+                    </a:xfrm>
+                    <a:prstGeom prst="rect"/>
+                  </pic:spPr>
+                </pic:pic>
+              </a:graphicData>
+            </a:graphic>
+          </wp:inline>
+        </w:drawing>
+      </w:r>
+    </w:p>
+    <w:p>
+      <w:pPr>
+        <w:jc w:val="center"/>
+      </w:pPr>
+      <w:r>
+        <w:rPr>
+          <w:i/>
+        </w:rPr>
+        <w:t>Figura 6. Demo — pagina Metricas.</w:t>
+      </w:r>
+    </w:p>
+    <w:p>
+      <w:r>
+        <w:drawing>
+          <wp:inline xmlns:a="http://schemas.openxmlformats.org/drawingml/2006/main" xmlns:pic="http://schemas.openxmlformats.org/drawingml/2006/picture">
+            <wp:extent cx="5303520" cy="2024980"/>
+            <wp:docPr id="8" name="Picture 8"/>
+            <wp:cNvGraphicFramePr>
+              <a:graphicFrameLocks noChangeAspect="1"/>
+            </wp:cNvGraphicFramePr>
+            <a:graphic>
+              <a:graphicData uri="http://schemas.openxmlformats.org/drawingml/2006/picture">
+                <pic:pic>
+                  <pic:nvPicPr>
+                    <pic:cNvPr id="0" name="demo_fallback.png"/>
+                    <pic:cNvPicPr/>
+                  </pic:nvPicPr>
+                  <pic:blipFill>
+                    <a:blip r:embed="rId15"/>
+                    <a:stretch>
+                      <a:fillRect/>
+                    </a:stretch>
+                  </pic:blipFill>
+                  <pic:spPr>
+                    <a:xfrm>
+                      <a:off x="0" y="0"/>
+                      <a:ext cx="5303520" cy="2024980"/>
+                    </a:xfrm>
+                    <a:prstGeom prst="rect"/>
+                  </pic:spPr>
+                </pic:pic>
+              </a:graphicData>
+            </a:graphic>
+          </wp:inline>
+        </w:drawing>
+      </w:r>
+    </w:p>
+    <w:p>
+      <w:pPr>
+        <w:jc w:val="center"/>
+      </w:pPr>
+      <w:r>
+        <w:rPr>
+          <w:i/>
+        </w:rPr>
+        <w:t>Figura 7. Fallback TF-IDF (modo degradado).</w:t>
       </w:r>
     </w:p>
     <w:p>
@@ -448,12 +932,17 @@
     </w:p>
     <w:p>
       <w:r>
-        <w:t>Evidencia: ROC-AUC 0.949 y localización 84.6 % sobre MEDEC; demo interactiva en 2 minutos.</w:t>
+        <w:t>Evidencia: ROC-AUC 0.949 y localización 84.6 % sobre MEDEC; demo Streamlit o frontend React + API FastAPI en minutos.</w:t>
       </w:r>
     </w:p>
     <w:p>
       <w:r>
-        <w:t>Despliegue recomendado: TF-IDF local en cascada → LLM solo en candidatas; Ollama para PHI; fallback transparente si la API cae.</w:t>
+        <w:t>Valor: apoyo a auditoría clínica y seguridad del paciente; despliegue recomendado en cascada TF-IDF local → LLM solo en candidatas; Ollama para PHI; fallback transparente.</w:t>
+      </w:r>
+    </w:p>
+    <w:p>
+      <w:r>
+        <w:t>Mensaje clave: el prototipo no diagnostica ni prescribe — prioriza oraciones sospechosas para revisión humana, con trazabilidad (scores, RAG, auditoría).</w:t>
       </w:r>
     </w:p>
     <w:p>
@@ -477,6 +966,16 @@
     <w:p>
       <w:r>
         <w:t>Lección S7: el valor clínico está en localizar la oración, no en clasificar la nota entera.</w:t>
+      </w:r>
+    </w:p>
+    <w:p>
+      <w:r>
+        <w:t>Corrección documental S10: el borrador S8 listaba capacidades ya implementadas como pendientes; este informe se reescribió desde el repositorio (rutas, métricas JSON, FastAPI/React) y separa claramente trabajo futuro (LangChain, Docker, DVC, MLflow).</w:t>
+      </w:r>
+    </w:p>
+    <w:p>
+      <w:r>
+        <w:t>Mejora aplicada post-feedback: eval_tfidf_idioma.py (stop words español) eleva test AUC a ~0.959 vs 0.949 english-only — evidencia en s10/evidencias/eval_tfidf_idioma.json.</w:t>
       </w:r>
     </w:p>
     <w:p>
@@ -509,7 +1008,12 @@
     </w:p>
     <w:p>
       <w:r>
-        <w:t>• LangChain, Docker, DVC, MLflow: plan futuro, no entregados en S10.</w:t>
+        <w:t>• Docker Compose para empaquetar API + frontend: plan futuro (FastAPI ya implementada).</w:t>
+      </w:r>
+    </w:p>
+    <w:p>
+      <w:r>
+        <w:t>• LangChain, DVC, MLflow: plan futuro, no entregados en S10.</w:t>
       </w:r>
     </w:p>
     <w:p>
@@ -554,7 +1058,23 @@
         <w:pStyle w:val="ListBullet"/>
       </w:pPr>
       <w:r>
-        <w:t>├── demo/        # Streamlit</w:t>
+        <w:t>├── api/         # FastAPI — POST /generar, GET /health</w:t>
+      </w:r>
+    </w:p>
+    <w:p>
+      <w:pPr>
+        <w:pStyle w:val="ListBullet"/>
+      </w:pPr>
+      <w:r>
+        <w:t>├── frontend/    # React + Vite (cliente HTTP)</w:t>
+      </w:r>
+    </w:p>
+    <w:p>
+      <w:pPr>
+        <w:pStyle w:val="ListBullet"/>
+      </w:pPr>
+      <w:r>
+        <w:t>├── demo/        # Streamlit (demo alternativa)</w:t>
       </w:r>
     </w:p>
     <w:p>
@@ -647,12 +1167,52 @@
         <w:pStyle w:val="ListBullet"/>
       </w:pPr>
       <w:r>
+        <w:t>python s10/capture_demo.py</w:t>
+      </w:r>
+    </w:p>
+    <w:p>
+      <w:pPr>
+        <w:pStyle w:val="ListBullet"/>
+      </w:pPr>
+      <w:r>
+        <w:t>python s10/organize_evidencias.py</w:t>
+      </w:r>
+    </w:p>
+    <w:p>
+      <w:pPr>
+        <w:pStyle w:val="ListBullet"/>
+      </w:pPr>
+      <w:r>
+        <w:t>python s10/generate_informe.py</w:t>
+      </w:r>
+    </w:p>
+    <w:p>
+      <w:pPr>
+        <w:pStyle w:val="ListBullet"/>
+      </w:pPr>
+      <w:r>
+        <w:t>uvicorn api.main:app --reload --port 8000</w:t>
+      </w:r>
+    </w:p>
+    <w:p>
+      <w:pPr>
+        <w:pStyle w:val="ListBullet"/>
+      </w:pPr>
+      <w:r>
+        <w:t>cd frontend &amp;&amp; npm install &amp;&amp; npm run dev</w:t>
+      </w:r>
+    </w:p>
+    <w:p>
+      <w:pPr>
+        <w:pStyle w:val="ListBullet"/>
+      </w:pPr>
+      <w:r>
         <w:t>streamlit run demo/app.py</w:t>
       </w:r>
     </w:p>
     <w:p>
       <w:r>
-        <w:t>Anexo A — Evidencias cuantitativas en s10/evidencias/ del repositorio.</w:t>
+        <w:t>Anexo A — Evidencias cuantitativas y capturas en s10/evidencias/ del repositorio.</w:t>
       </w:r>
     </w:p>
     <w:p>
@@ -675,7 +1235,7 @@
     </w:p>
     <w:p>
       <w:r>
-        <w:t>Documentación complementaria: s7/docs/informe_produccion.md, s7/docs/reporte_interpretabilidad_etica.md, s6/BITACORA.md.</w:t>
+        <w:t>Documentación complementaria: s7/docs/informe_produccion.md, s7/docs/reporte_interpretabilidad_etica.md, s6/BITACORA.md, s10/README.md.</w:t>
       </w:r>
     </w:p>
     <w:sectPr>

</xml_diff>